<commit_message>
update 虎力值 PRD v1.3 + proto (review fixes)
</commit_message>
<xml_diff>
--- a/hlz-prd.docx
+++ b/hlz-prd.docx
@@ -436,6 +436,125 @@
                 <w:b w:val="0"/>
               </w:rPr>
               <w:t>原型二次评审整改：① 批量弹窗筛选区重构为「统一筛选」——标签改为下拉多选、手机号/昵称/用户ID 作为并列筛选项，仅保留一个「搜索」按钮统一触发组合查询（点击搜索时一次性向服务端发起筛选），移除原平铺 checkbox 与按条件单独搜索；② 移除原型内大号紫色步骤序号，仅保留分区标题并优化排版；③ 备注文本框高度上调；④ 保留「重置」与「批量导入表格 / 下载导入模板」</w:t>
+            </w:r>
+          </w:p>
+        </w:tc>
+        <w:tc>
+          <w:tcPr>
+            <w:tcW w:type="dxa" w:w="1728"/>
+          </w:tcPr>
+          <w:p>
+            <w:r/>
+            <w:r>
+              <w:rPr>
+                <w:rFonts w:eastAsia="Microsoft YaHei" w:ascii="Microsoft YaHei" w:hAnsi="Microsoft YaHei"/>
+                <w:b w:val="0"/>
+              </w:rPr>
+              <w:t>已定稿</w:t>
+            </w:r>
+          </w:p>
+        </w:tc>
+      </w:tr>
+      <w:tr>
+        <w:tc>
+          <w:tcPr>
+            <w:tcW w:type="dxa" w:w="1728"/>
+          </w:tcPr>
+          <w:p>
+            <w:r/>
+            <w:r>
+              <w:rPr>
+                <w:rFonts w:eastAsia="Microsoft YaHei" w:ascii="Microsoft YaHei" w:hAnsi="Microsoft YaHei"/>
+                <w:b w:val="0"/>
+              </w:rPr>
+              <w:t>v1.3</w:t>
+            </w:r>
+          </w:p>
+        </w:tc>
+        <w:tc>
+          <w:tcPr>
+            <w:tcW w:type="dxa" w:w="1728"/>
+          </w:tcPr>
+          <w:p>
+            <w:r/>
+            <w:r>
+              <w:rPr>
+                <w:rFonts w:eastAsia="Microsoft YaHei" w:ascii="Microsoft YaHei" w:hAnsi="Microsoft YaHei"/>
+                <w:b w:val="0"/>
+              </w:rPr>
+              <w:t>2026-07-30</w:t>
+            </w:r>
+          </w:p>
+        </w:tc>
+        <w:tc>
+          <w:tcPr>
+            <w:tcW w:type="dxa" w:w="1728"/>
+          </w:tcPr>
+          <w:p>
+            <w:r/>
+            <w:r>
+              <w:rPr>
+                <w:rFonts w:eastAsia="Microsoft YaHei" w:ascii="Microsoft YaHei" w:hAnsi="Microsoft YaHei"/>
+                <w:b w:val="0"/>
+              </w:rPr>
+              <w:t>PM</w:t>
+            </w:r>
+          </w:p>
+        </w:tc>
+        <w:tc>
+          <w:tcPr>
+            <w:tcW w:type="dxa" w:w="1728"/>
+          </w:tcPr>
+          <w:p>
+            <w:r/>
+            <w:r>
+              <w:rPr>
+                <w:rFonts w:eastAsia="Microsoft YaHei" w:ascii="Microsoft YaHei" w:hAnsi="Microsoft YaHei"/>
+                <w:b w:val="0"/>
+              </w:rPr>
+              <w:t>评审整改（8 项）：① 活动标签改为</w:t>
+            </w:r>
+            <w:r>
+              <w:rPr>
+                <w:rFonts w:eastAsia="Microsoft YaHei" w:ascii="Microsoft YaHei" w:hAnsi="Microsoft YaHei"/>
+                <w:b/>
+              </w:rPr>
+              <w:t>单选</w:t>
+            </w:r>
+            <w:r>
+              <w:rPr>
+                <w:rFonts w:eastAsia="Microsoft YaHei" w:ascii="Microsoft YaHei" w:hAnsi="Microsoft YaHei"/>
+                <w:b w:val="0"/>
+              </w:rPr>
+              <w:t>下拉（枚举取自活动标签体系，非用户行为标签）；② 活动标签与手机号</w:t>
+            </w:r>
+            <w:r>
+              <w:rPr>
+                <w:rFonts w:eastAsia="Microsoft YaHei" w:ascii="Microsoft YaHei" w:hAnsi="Microsoft YaHei"/>
+                <w:b/>
+              </w:rPr>
+              <w:t>互斥</w:t>
+            </w:r>
+            <w:r>
+              <w:rPr>
+                <w:rFonts w:eastAsia="Microsoft YaHei" w:ascii="Microsoft YaHei" w:hAnsi="Microsoft YaHei"/>
+                <w:b w:val="0"/>
+              </w:rPr>
+              <w:t>，不可同时作为搜索条件；③ 移除昵称搜索（仅支持手机号精确/模糊查询）；④ 移除用户ID 搜索条件；⑤ 保留批量导入表格 / 下载导入模板；⑥ 移除「其他（自定义理由）」选项，理由仅支持预设字典枚举；⑦ 后管手机号展示取消脱敏，</w:t>
+            </w:r>
+            <w:r>
+              <w:rPr>
+                <w:rFonts w:eastAsia="Microsoft YaHei" w:ascii="Microsoft YaHei" w:hAnsi="Microsoft YaHei"/>
+                <w:b/>
+              </w:rPr>
+              <w:t>直接明文显示</w:t>
+            </w:r>
+            <w:r>
+              <w:rPr>
+                <w:rFonts w:eastAsia="Microsoft YaHei" w:ascii="Microsoft YaHei" w:hAnsi="Microsoft YaHei"/>
+                <w:b w:val="0"/>
+              </w:rPr>
+              <w:t>（如 13812341234）</w:t>
             </w:r>
           </w:p>
         </w:tc>
@@ -2065,7 +2184,7 @@
         </w:rPr>
         <w:drawing>
           <wp:inline xmlns:a="http://schemas.openxmlformats.org/drawingml/2006/main" xmlns:pic="http://schemas.openxmlformats.org/drawingml/2006/picture">
-            <wp:extent cx="5303520" cy="3314700"/>
+            <wp:extent cx="5303520" cy="3720751"/>
             <wp:docPr id="4" name="Picture 4"/>
             <wp:cNvGraphicFramePr>
               <a:graphicFrameLocks noChangeAspect="1"/>
@@ -2086,7 +2205,7 @@
                   <pic:spPr>
                     <a:xfrm>
                       <a:off x="0" y="0"/>
-                      <a:ext cx="5303520" cy="3314700"/>
+                      <a:ext cx="5303520" cy="3720751"/>
                     </a:xfrm>
                     <a:prstGeom prst="rect"/>
                   </pic:spPr>
@@ -2492,7 +2611,7 @@
                 <w:rFonts w:eastAsia="Microsoft YaHei" w:ascii="Microsoft YaHei" w:hAnsi="Microsoft YaHei"/>
                 <w:b w:val="0"/>
               </w:rPr>
-              <w:t>操作时选择的理由文本（来自预设字典或自由填写）</w:t>
+              <w:t>操作时选择的理由文本（来自预设字典，不支持自定义）</w:t>
             </w:r>
           </w:p>
         </w:tc>
@@ -3540,7 +3659,7 @@
         </w:rPr>
         <w:drawing>
           <wp:inline xmlns:a="http://schemas.openxmlformats.org/drawingml/2006/main" xmlns:pic="http://schemas.openxmlformats.org/drawingml/2006/picture">
-            <wp:extent cx="5303520" cy="3729038"/>
+            <wp:extent cx="5303520" cy="3720751"/>
             <wp:docPr id="5" name="Picture 5"/>
             <wp:cNvGraphicFramePr>
               <a:graphicFrameLocks noChangeAspect="1"/>
@@ -3561,7 +3680,7 @@
                   <pic:spPr>
                     <a:xfrm>
                       <a:off x="0" y="0"/>
-                      <a:ext cx="5303520" cy="3729038"/>
+                      <a:ext cx="5303520" cy="3720751"/>
                     </a:xfrm>
                     <a:prstGeom prst="rect"/>
                   </pic:spPr>
@@ -3592,7 +3711,63 @@
           <w:rFonts w:eastAsia="Microsoft YaHei" w:ascii="Microsoft YaHei" w:hAnsi="Microsoft YaHei"/>
           <w:b w:val="0"/>
         </w:rPr>
-        <w:t>点击「批量赠送」或「批量扣除」按钮后弹出此面板。面板包含五个区域：统一筛选区、目标用户列表、理由选择区、数量填写区、备注区。统一筛选区将「标签（下拉多选）、手机号/昵称、用户ID」作为并列筛选项，运营先勾选/填写所有条件后点击唯一「搜索」按钮一次性触发组合查询，命中或导入的用户统一进入「目标用户列表」直接作为待操作名单（</w:t>
+        <w:t>点击「批量赠送」或「批量扣除」按钮后弹出此面板。面板包含五个区域：统一筛选区、目标用户列表、理由选择区、数量填写区、备注区。统一筛选区提供两种</w:t>
+      </w:r>
+      <w:r>
+        <w:rPr>
+          <w:rFonts w:eastAsia="Microsoft YaHei" w:ascii="Microsoft YaHei" w:hAnsi="Microsoft YaHei"/>
+          <w:b/>
+        </w:rPr>
+        <w:t>互斥</w:t>
+      </w:r>
+      <w:r>
+        <w:rPr>
+          <w:rFonts w:eastAsia="Microsoft YaHei" w:ascii="Microsoft YaHei" w:hAnsi="Microsoft YaHei"/>
+          <w:b w:val="0"/>
+        </w:rPr>
+        <w:t xml:space="preserve">的人员筛选方式——① </w:t>
+      </w:r>
+      <w:r>
+        <w:rPr>
+          <w:rFonts w:eastAsia="Microsoft YaHei" w:ascii="Microsoft YaHei" w:hAnsi="Microsoft YaHei"/>
+          <w:b/>
+        </w:rPr>
+        <w:t>活动标签</w:t>
+      </w:r>
+      <w:r>
+        <w:rPr>
+          <w:rFonts w:eastAsia="Microsoft YaHei" w:ascii="Microsoft YaHei" w:hAnsi="Microsoft YaHei"/>
+          <w:b w:val="0"/>
+        </w:rPr>
+        <w:t xml:space="preserve">（单选下拉，枚举取自活动标签体系）；② </w:t>
+      </w:r>
+      <w:r>
+        <w:rPr>
+          <w:rFonts w:eastAsia="Microsoft YaHei" w:ascii="Microsoft YaHei" w:hAnsi="Microsoft YaHei"/>
+          <w:b/>
+        </w:rPr>
+        <w:t>手机号</w:t>
+      </w:r>
+      <w:r>
+        <w:rPr>
+          <w:rFonts w:eastAsia="Microsoft YaHei" w:ascii="Microsoft YaHei" w:hAnsi="Microsoft YaHei"/>
+          <w:b w:val="0"/>
+        </w:rPr>
+        <w:t>（精确/模糊查询）。两者</w:t>
+      </w:r>
+      <w:r>
+        <w:rPr>
+          <w:rFonts w:eastAsia="Microsoft YaHei" w:ascii="Microsoft YaHei" w:hAnsi="Microsoft YaHei"/>
+          <w:b/>
+        </w:rPr>
+        <w:t>不可同时</w:t>
+      </w:r>
+      <w:r>
+        <w:rPr>
+          <w:rFonts w:eastAsia="Microsoft YaHei" w:ascii="Microsoft YaHei" w:hAnsi="Microsoft YaHei"/>
+          <w:b w:val="0"/>
+        </w:rPr>
+        <w:t>作为搜索条件；运营选好其中一种后点击唯一「搜索」按钮触发查询，命中或导入的用户统一进入「目标用户列表」直接作为待操作名单（</w:t>
       </w:r>
       <w:r>
         <w:rPr>
@@ -3607,6 +3782,34 @@
           <w:b w:val="0"/>
         </w:rPr>
         <w:t>）。</w:t>
+      </w:r>
+      <w:r>
+        <w:rPr>
+          <w:rFonts w:eastAsia="Microsoft YaHei" w:ascii="Microsoft YaHei" w:hAnsi="Microsoft YaHei"/>
+          <w:b/>
+        </w:rPr>
+        <w:t>不支持</w:t>
+      </w:r>
+      <w:r>
+        <w:rPr>
+          <w:rFonts w:eastAsia="Microsoft YaHei" w:ascii="Microsoft YaHei" w:hAnsi="Microsoft YaHei"/>
+          <w:b w:val="0"/>
+        </w:rPr>
+        <w:t>昵称、用户ID 搜索；理由</w:t>
+      </w:r>
+      <w:r>
+        <w:rPr>
+          <w:rFonts w:eastAsia="Microsoft YaHei" w:ascii="Microsoft YaHei" w:hAnsi="Microsoft YaHei"/>
+          <w:b/>
+        </w:rPr>
+        <w:t>仅支持预设字典枚举</w:t>
+      </w:r>
+      <w:r>
+        <w:rPr>
+          <w:rFonts w:eastAsia="Microsoft YaHei" w:ascii="Microsoft YaHei" w:hAnsi="Microsoft YaHei"/>
+          <w:b w:val="0"/>
+        </w:rPr>
+        <w:t>（不支持自定义）。</w:t>
       </w:r>
     </w:p>
     <w:p>
@@ -3766,7 +3969,7 @@
                 <w:rFonts w:eastAsia="Microsoft YaHei" w:ascii="Microsoft YaHei" w:hAnsi="Microsoft YaHei"/>
                 <w:b w:val="0"/>
               </w:rPr>
-              <w:t>筛选条件组（标签下拉多选 + 手机号/昵称 + 用户ID）+「搜索」「重置」</w:t>
+              <w:t>筛选条件组（活动标签单选下拉 + 手机号）+「搜索」「重置」</w:t>
             </w:r>
           </w:p>
         </w:tc>
@@ -3781,7 +3984,7 @@
                 <w:rFonts w:eastAsia="Microsoft YaHei" w:ascii="Microsoft YaHei" w:hAnsi="Microsoft YaHei"/>
                 <w:b/>
               </w:rPr>
-              <w:t>所有筛选条件先选/填，再点唯一「搜索」按钮统一触发组合查询</w:t>
+              <w:t>活动标签与手机号互斥，二选一搜索</w:t>
             </w:r>
             <w:r>
               <w:rPr>
@@ -3795,28 +3998,84 @@
                 <w:rFonts w:eastAsia="Microsoft YaHei" w:ascii="Microsoft YaHei" w:hAnsi="Microsoft YaHei"/>
                 <w:b/>
               </w:rPr>
-              <w:t>标签</w:t>
+              <w:t>活动标签</w:t>
             </w:r>
             <w:r>
               <w:rPr>
                 <w:rFonts w:eastAsia="Microsoft YaHei" w:ascii="Microsoft YaHei" w:hAnsi="Microsoft YaHei"/>
                 <w:b w:val="0"/>
               </w:rPr>
-              <w:t xml:space="preserve">为「下拉多选」控件，点击展开勾选一个或多个用户标签（高活跃/沉睡用户/新用户/付费用户/VIP会员/风险用户），不再平铺 checkbox；② 手机号/昵称输入框支持模糊搜索；③ 用户ID输入框支持多个用逗号隔开。点击「搜索」→ 前端收集全部条件调用 </w:t>
+              <w:t>为「单选下拉」，点击展开选择一个活动标签（双11大促/周年庆/新人专享/会员日/沉睡唤醒/618复盘，</w:t>
+            </w:r>
+            <w:r>
+              <w:rPr>
+                <w:rFonts w:eastAsia="Microsoft YaHei" w:ascii="Microsoft YaHei" w:hAnsi="Microsoft YaHei"/>
+                <w:b w:val="0"/>
+              </w:rPr>
+              <w:t>@干系人 确认实际枚举</w:t>
+            </w:r>
+            <w:r>
+              <w:rPr>
+                <w:rFonts w:eastAsia="Microsoft YaHei" w:ascii="Microsoft YaHei" w:hAnsi="Microsoft YaHei"/>
+                <w:b w:val="0"/>
+              </w:rPr>
+              <w:t xml:space="preserve">），选中后点击「搜索」调用 </w:t>
             </w:r>
             <w:r>
               <w:rPr>
                 <w:rFonts w:ascii="Microsoft YaHei" w:hAnsi="Microsoft YaHei" w:eastAsia="Microsoft YaHei"/>
                 <w:color w:val="BE123C"/>
               </w:rPr>
-              <w:t>GET /api/admin/users?tags=标签1,标签2&amp;phone=手机号&amp;ids=用户ID&amp;page=1&amp;size=500</w:t>
+              <w:t>GET /api/admin/users?tag=活动标签</w:t>
             </w:r>
             <w:r>
               <w:rPr>
                 <w:rFonts w:eastAsia="Microsoft YaHei" w:ascii="Microsoft YaHei" w:hAnsi="Microsoft YaHei"/>
                 <w:b w:val="0"/>
               </w:rPr>
-              <w:t xml:space="preserve"> 一次性筛选，命中用户直接加入目标用户列表。点击「重置」清空所有筛选项并仅移除由筛选命中的用户（导入用户保留）。</w:t>
+              <w:t xml:space="preserve"> 返回该标签下用户；② </w:t>
+            </w:r>
+            <w:r>
+              <w:rPr>
+                <w:rFonts w:eastAsia="Microsoft YaHei" w:ascii="Microsoft YaHei" w:hAnsi="Microsoft YaHei"/>
+                <w:b/>
+              </w:rPr>
+              <w:t>手机号</w:t>
+            </w:r>
+            <w:r>
+              <w:rPr>
+                <w:rFonts w:eastAsia="Microsoft YaHei" w:ascii="Microsoft YaHei" w:hAnsi="Microsoft YaHei"/>
+                <w:b w:val="0"/>
+              </w:rPr>
+              <w:t xml:space="preserve">输入框支持精确/模糊查询，点击「搜索」调用 </w:t>
+            </w:r>
+            <w:r>
+              <w:rPr>
+                <w:rFonts w:ascii="Microsoft YaHei" w:hAnsi="Microsoft YaHei" w:eastAsia="Microsoft YaHei"/>
+                <w:color w:val="BE123C"/>
+              </w:rPr>
+              <w:t>GET /api/admin/users?phone=手机号</w:t>
+            </w:r>
+            <w:r>
+              <w:rPr>
+                <w:rFonts w:eastAsia="Microsoft YaHei" w:ascii="Microsoft YaHei" w:hAnsi="Microsoft YaHei"/>
+                <w:b w:val="0"/>
+              </w:rPr>
+              <w:t xml:space="preserve"> 返回匹配用户。两者</w:t>
+            </w:r>
+            <w:r>
+              <w:rPr>
+                <w:rFonts w:eastAsia="Microsoft YaHei" w:ascii="Microsoft YaHei" w:hAnsi="Microsoft YaHei"/>
+                <w:b/>
+              </w:rPr>
+              <w:t>同时填写</w:t>
+            </w:r>
+            <w:r>
+              <w:rPr>
+                <w:rFonts w:eastAsia="Microsoft YaHei" w:ascii="Microsoft YaHei" w:hAnsi="Microsoft YaHei"/>
+                <w:b w:val="0"/>
+              </w:rPr>
+              <w:t>时点「搜索」→ 提示「活动标签与手机号不可同时搜索，请只保留一种方式」并拦截。命中用户直接加入目标用户列表。点击「重置」清空筛选输入并仅移除由筛选命中的用户（导入用户保留）。</w:t>
             </w:r>
           </w:p>
         </w:tc>
@@ -3831,7 +4090,35 @@
                 <w:rFonts w:eastAsia="Microsoft YaHei" w:ascii="Microsoft YaHei" w:hAnsi="Microsoft YaHei"/>
                 <w:b w:val="0"/>
               </w:rPr>
-              <w:t>仅「搜索」「重置」两个按钮，不为每个条件单独配按钮；标签枚举来自用户标签体系</w:t>
+              <w:t>仅「搜索」「重置」两个按钮；</w:t>
+            </w:r>
+            <w:r>
+              <w:rPr>
+                <w:rFonts w:eastAsia="Microsoft YaHei" w:ascii="Microsoft YaHei" w:hAnsi="Microsoft YaHei"/>
+                <w:b/>
+              </w:rPr>
+              <w:t>不支持昵称、用户ID 搜索</w:t>
+            </w:r>
+            <w:r>
+              <w:rPr>
+                <w:rFonts w:eastAsia="Microsoft YaHei" w:ascii="Microsoft YaHei" w:hAnsi="Microsoft YaHei"/>
+                <w:b w:val="0"/>
+              </w:rPr>
+              <w:t>；活动标签枚举取自营销活动标签体系（</w:t>
+            </w:r>
+            <w:r>
+              <w:rPr>
+                <w:rFonts w:eastAsia="Microsoft YaHei" w:ascii="Microsoft YaHei" w:hAnsi="Microsoft YaHei"/>
+                <w:b w:val="0"/>
+              </w:rPr>
+              <w:t>@干系人 确认</w:t>
+            </w:r>
+            <w:r>
+              <w:rPr>
+                <w:rFonts w:eastAsia="Microsoft YaHei" w:ascii="Microsoft YaHei" w:hAnsi="Microsoft YaHei"/>
+                <w:b w:val="0"/>
+              </w:rPr>
+              <w:t>）</w:t>
             </w:r>
           </w:p>
         </w:tc>
@@ -3954,7 +4241,7 @@
                 <w:rFonts w:eastAsia="Microsoft YaHei" w:ascii="Microsoft YaHei" w:hAnsi="Microsoft YaHei"/>
                 <w:b w:val="0"/>
               </w:rPr>
-              <w:t>标签筛选命中 + 手动添加 + 导入 三类用户</w:t>
+              <w:t>标签筛选命中 + 导入 两类用户</w:t>
             </w:r>
             <w:r>
               <w:rPr>
@@ -4044,7 +4331,14 @@
                 <w:rFonts w:eastAsia="Microsoft YaHei" w:ascii="Microsoft YaHei" w:hAnsi="Microsoft YaHei"/>
                 <w:b w:val="0"/>
               </w:rPr>
-              <w:t>），枚举明细见本表下方清单</w:t>
+              <w:t>），枚举明细见本表下方清单；</w:t>
+            </w:r>
+            <w:r>
+              <w:rPr>
+                <w:rFonts w:eastAsia="Microsoft YaHei" w:ascii="Microsoft YaHei" w:hAnsi="Microsoft YaHei"/>
+                <w:b/>
+              </w:rPr>
+              <w:t>仅支持预设枚举，不支持自定义输入</w:t>
             </w:r>
           </w:p>
         </w:tc>
@@ -4076,7 +4370,7 @@
                 <w:rFonts w:eastAsia="Microsoft YaHei" w:ascii="Microsoft YaHei" w:hAnsi="Microsoft YaHei"/>
                 <w:b w:val="0"/>
               </w:rPr>
-              <w:t>—</w:t>
+              <w:t>数量填写区</w:t>
             </w:r>
           </w:p>
         </w:tc>
@@ -4091,7 +4385,7 @@
                 <w:rFonts w:eastAsia="Microsoft YaHei" w:ascii="Microsoft YaHei" w:hAnsi="Microsoft YaHei"/>
                 <w:b w:val="0"/>
               </w:rPr>
-              <w:t>其他理由输入框</w:t>
+              <w:t>虎力值数量输入框</w:t>
             </w:r>
           </w:p>
         </w:tc>
@@ -4106,7 +4400,7 @@
                 <w:rFonts w:eastAsia="Microsoft YaHei" w:ascii="Microsoft YaHei" w:hAnsi="Microsoft YaHei"/>
                 <w:b w:val="0"/>
               </w:rPr>
-              <w:t>选择「其他」时显示，自由文本输入，最大长度 50 字符</w:t>
+              <w:t>数字输入，统一应用于目标用户列表每位用户</w:t>
             </w:r>
           </w:p>
         </w:tc>
@@ -4121,7 +4415,7 @@
                 <w:rFonts w:eastAsia="Microsoft YaHei" w:ascii="Microsoft YaHei" w:hAnsi="Microsoft YaHei"/>
                 <w:b w:val="0"/>
               </w:rPr>
-              <w:t>仅「其他」选项可见</w:t>
+              <w:t>赠送：正整数；扣除：正整数（后端存为负值）</w:t>
             </w:r>
           </w:p>
         </w:tc>
@@ -4138,7 +4432,7 @@
                 <w:rFonts w:eastAsia="Microsoft YaHei" w:ascii="Microsoft YaHei" w:hAnsi="Microsoft YaHei"/>
                 <w:b w:val="0"/>
               </w:rPr>
-              <w:t>数量填写区</w:t>
+              <w:t>备注区</w:t>
             </w:r>
           </w:p>
         </w:tc>
@@ -4153,7 +4447,7 @@
                 <w:rFonts w:eastAsia="Microsoft YaHei" w:ascii="Microsoft YaHei" w:hAnsi="Microsoft YaHei"/>
                 <w:b w:val="0"/>
               </w:rPr>
-              <w:t>虎力值数量输入框</w:t>
+              <w:t>备注文本框</w:t>
             </w:r>
           </w:p>
         </w:tc>
@@ -4166,9 +4460,16 @@
             <w:r>
               <w:rPr>
                 <w:rFonts w:eastAsia="Microsoft YaHei" w:ascii="Microsoft YaHei" w:hAnsi="Microsoft YaHei"/>
+                <w:b/>
+              </w:rPr>
+              <w:t>必填</w:t>
+            </w:r>
+            <w:r>
+              <w:rPr>
+                <w:rFonts w:eastAsia="Microsoft YaHei" w:ascii="Microsoft YaHei" w:hAnsi="Microsoft YaHei"/>
                 <w:b w:val="0"/>
               </w:rPr>
-              <w:t>数字输入，统一应用于目标用户列表每位用户</w:t>
+              <w:t>，记录本次操作说明（如活动背景、工单号），最多 500 字，超出禁止输入</w:t>
             </w:r>
           </w:p>
         </w:tc>
@@ -4183,7 +4484,7 @@
                 <w:rFonts w:eastAsia="Microsoft YaHei" w:ascii="Microsoft YaHei" w:hAnsi="Microsoft YaHei"/>
                 <w:b w:val="0"/>
               </w:rPr>
-              <w:t>赠送：正整数；扣除：正整数（后端存为负值）</w:t>
+              <w:t>取《操作记录表》remark；列表与明细弹窗均展示</w:t>
             </w:r>
           </w:p>
         </w:tc>
@@ -4200,7 +4501,7 @@
                 <w:rFonts w:eastAsia="Microsoft YaHei" w:ascii="Microsoft YaHei" w:hAnsi="Microsoft YaHei"/>
                 <w:b w:val="0"/>
               </w:rPr>
-              <w:t>备注区</w:t>
+              <w:t>操作按钮</w:t>
             </w:r>
           </w:p>
         </w:tc>
@@ -4215,7 +4516,7 @@
                 <w:rFonts w:eastAsia="Microsoft YaHei" w:ascii="Microsoft YaHei" w:hAnsi="Microsoft YaHei"/>
                 <w:b w:val="0"/>
               </w:rPr>
-              <w:t>备注文本框</w:t>
+              <w:t>确认赠送 / 确认扣除</w:t>
             </w:r>
           </w:p>
         </w:tc>
@@ -4228,16 +4529,9 @@
             <w:r>
               <w:rPr>
                 <w:rFonts w:eastAsia="Microsoft YaHei" w:ascii="Microsoft YaHei" w:hAnsi="Microsoft YaHei"/>
-                <w:b/>
-              </w:rPr>
-              <w:t>必填</w:t>
-            </w:r>
-            <w:r>
-              <w:rPr>
-                <w:rFonts w:eastAsia="Microsoft YaHei" w:ascii="Microsoft YaHei" w:hAnsi="Microsoft YaHei"/>
                 <w:b w:val="0"/>
               </w:rPr>
-              <w:t>，记录本次操作说明（如活动背景、工单号），最多 500 字，超出禁止输入</w:t>
+              <w:t>根据入口按钮区分，提交时对目标用户列表全部用户生效</w:t>
             </w:r>
           </w:p>
         </w:tc>
@@ -4252,7 +4546,7 @@
                 <w:rFonts w:eastAsia="Microsoft YaHei" w:ascii="Microsoft YaHei" w:hAnsi="Microsoft YaHei"/>
                 <w:b w:val="0"/>
               </w:rPr>
-              <w:t>取《操作记录表》remark；列表与明细弹窗均展示</w:t>
+              <w:t>提交前校验（见下方逻辑）</w:t>
             </w:r>
           </w:p>
         </w:tc>
@@ -4269,68 +4563,6 @@
                 <w:rFonts w:eastAsia="Microsoft YaHei" w:ascii="Microsoft YaHei" w:hAnsi="Microsoft YaHei"/>
                 <w:b w:val="0"/>
               </w:rPr>
-              <w:t>操作按钮</w:t>
-            </w:r>
-          </w:p>
-        </w:tc>
-        <w:tc>
-          <w:tcPr>
-            <w:tcW w:type="dxa" w:w="2160"/>
-          </w:tcPr>
-          <w:p>
-            <w:r/>
-            <w:r>
-              <w:rPr>
-                <w:rFonts w:eastAsia="Microsoft YaHei" w:ascii="Microsoft YaHei" w:hAnsi="Microsoft YaHei"/>
-                <w:b w:val="0"/>
-              </w:rPr>
-              <w:t>确认赠送 / 确认扣除</w:t>
-            </w:r>
-          </w:p>
-        </w:tc>
-        <w:tc>
-          <w:tcPr>
-            <w:tcW w:type="dxa" w:w="2160"/>
-          </w:tcPr>
-          <w:p>
-            <w:r/>
-            <w:r>
-              <w:rPr>
-                <w:rFonts w:eastAsia="Microsoft YaHei" w:ascii="Microsoft YaHei" w:hAnsi="Microsoft YaHei"/>
-                <w:b w:val="0"/>
-              </w:rPr>
-              <w:t>根据入口按钮区分，提交时对目标用户列表全部用户生效</w:t>
-            </w:r>
-          </w:p>
-        </w:tc>
-        <w:tc>
-          <w:tcPr>
-            <w:tcW w:type="dxa" w:w="2160"/>
-          </w:tcPr>
-          <w:p>
-            <w:r/>
-            <w:r>
-              <w:rPr>
-                <w:rFonts w:eastAsia="Microsoft YaHei" w:ascii="Microsoft YaHei" w:hAnsi="Microsoft YaHei"/>
-                <w:b w:val="0"/>
-              </w:rPr>
-              <w:t>提交前校验（见下方逻辑）</w:t>
-            </w:r>
-          </w:p>
-        </w:tc>
-      </w:tr>
-      <w:tr>
-        <w:tc>
-          <w:tcPr>
-            <w:tcW w:type="dxa" w:w="2160"/>
-          </w:tcPr>
-          <w:p>
-            <w:r/>
-            <w:r>
-              <w:rPr>
-                <w:rFonts w:eastAsia="Microsoft YaHei" w:ascii="Microsoft YaHei" w:hAnsi="Microsoft YaHei"/>
-                <w:b w:val="0"/>
-              </w:rPr>
               <w:t>—</w:t>
             </w:r>
           </w:p>
@@ -4388,14 +4620,14 @@
           <w:rFonts w:eastAsia="Microsoft YaHei" w:ascii="Microsoft YaHei" w:hAnsi="Microsoft YaHei"/>
           <w:b/>
         </w:rPr>
-        <w:t>预设理由枚举（已有字典，非本期新建）：</w:t>
+        <w:t>预设理由枚举（已有字典，非本期新建，仅支持枚举、不支持自定义）：</w:t>
       </w:r>
       <w:r>
         <w:rPr>
           <w:rFonts w:eastAsia="Microsoft YaHei" w:ascii="Microsoft YaHei" w:hAnsi="Microsoft YaHei"/>
           <w:b w:val="0"/>
         </w:rPr>
-        <w:t>客服补偿 / 活动奖励补发 / 体验回馈 / 违规处罚 / 系统调整 / 误操作退回 / 其他（选中后自由填写，最长 50 字）。</w:t>
+        <w:t>客服补偿 / 活动奖励补发 / 体验回馈 / 违规处罚 / 系统调整 / 误操作退回。</w:t>
       </w:r>
     </w:p>
     <w:p>
@@ -4438,56 +4670,70 @@
           <w:rFonts w:eastAsia="Microsoft YaHei" w:ascii="Microsoft YaHei" w:hAnsi="Microsoft YaHei"/>
           <w:b/>
         </w:rPr>
-        <w:t>选择筛选条件：</w:t>
+        <w:t>选择筛选条件（二选一）：</w:t>
       </w:r>
       <w:r>
         <w:rPr>
           <w:rFonts w:eastAsia="Microsoft YaHei" w:ascii="Microsoft YaHei" w:hAnsi="Microsoft YaHei"/>
           <w:b w:val="0"/>
         </w:rPr>
-        <w:t xml:space="preserve">运营先在统一筛选区设置条件——① </w:t>
+        <w:t xml:space="preserve">运营在统一筛选区选择一种方式——① </w:t>
       </w:r>
       <w:r>
         <w:rPr>
           <w:rFonts w:eastAsia="Microsoft YaHei" w:ascii="Microsoft YaHei" w:hAnsi="Microsoft YaHei"/>
           <w:b/>
         </w:rPr>
-        <w:t>标签</w:t>
+        <w:t>活动标签</w:t>
       </w:r>
       <w:r>
         <w:rPr>
           <w:rFonts w:eastAsia="Microsoft YaHei" w:ascii="Microsoft YaHei" w:hAnsi="Microsoft YaHei"/>
           <w:b w:val="0"/>
         </w:rPr>
-        <w:t xml:space="preserve">为下拉多选，点击展开后勾选一个或多个用户标签（支持多选，不再平铺 checkbox）；② </w:t>
+        <w:t>：下拉单选一个活动标签（双11大促/周年庆/新人专享/会员日/沉睡唤醒/618复盘，</w:t>
+      </w:r>
+      <w:r>
+        <w:rPr>
+          <w:rFonts w:eastAsia="Microsoft YaHei" w:ascii="Microsoft YaHei" w:hAnsi="Microsoft YaHei"/>
+          <w:b w:val="0"/>
+        </w:rPr>
+        <w:t>@干系人 确认实际枚举</w:t>
+      </w:r>
+      <w:r>
+        <w:rPr>
+          <w:rFonts w:eastAsia="Microsoft YaHei" w:ascii="Microsoft YaHei" w:hAnsi="Microsoft YaHei"/>
+          <w:b w:val="0"/>
+        </w:rPr>
+        <w:t xml:space="preserve">）；或 ② </w:t>
       </w:r>
       <w:r>
         <w:rPr>
           <w:rFonts w:eastAsia="Microsoft YaHei" w:ascii="Microsoft YaHei" w:hAnsi="Microsoft YaHei"/>
           <w:b/>
         </w:rPr>
-        <w:t>手机号/昵称</w:t>
+        <w:t>手机号</w:t>
       </w:r>
       <w:r>
         <w:rPr>
           <w:rFonts w:eastAsia="Microsoft YaHei" w:ascii="Microsoft YaHei" w:hAnsi="Microsoft YaHei"/>
           <w:b w:val="0"/>
         </w:rPr>
-        <w:t xml:space="preserve">输入框支持模糊搜索；③ </w:t>
+        <w:t>：输入框填写手机号（支持精确/模糊）。</w:t>
       </w:r>
       <w:r>
         <w:rPr>
           <w:rFonts w:eastAsia="Microsoft YaHei" w:ascii="Microsoft YaHei" w:hAnsi="Microsoft YaHei"/>
           <w:b/>
         </w:rPr>
-        <w:t>用户ID</w:t>
+        <w:t>两者不可同时填写</w:t>
       </w:r>
       <w:r>
         <w:rPr>
           <w:rFonts w:eastAsia="Microsoft YaHei" w:ascii="Microsoft YaHei" w:hAnsi="Microsoft YaHei"/>
           <w:b w:val="0"/>
         </w:rPr>
-        <w:t>输入框支持多个用逗号隔开。</w:t>
+        <w:t>。</w:t>
       </w:r>
     </w:p>
     <w:p>
@@ -4506,35 +4752,49 @@
           <w:rFonts w:eastAsia="Microsoft YaHei" w:ascii="Microsoft YaHei" w:hAnsi="Microsoft YaHei"/>
           <w:b w:val="0"/>
         </w:rPr>
-        <w:t xml:space="preserve">前端收集全部已设条件，调用 </w:t>
+        <w:t>若活动标签与手机号</w:t>
+      </w:r>
+      <w:r>
+        <w:rPr>
+          <w:rFonts w:eastAsia="Microsoft YaHei" w:ascii="Microsoft YaHei" w:hAnsi="Microsoft YaHei"/>
+          <w:b/>
+        </w:rPr>
+        <w:t>同时填写</w:t>
+      </w:r>
+      <w:r>
+        <w:rPr>
+          <w:rFonts w:eastAsia="Microsoft YaHei" w:ascii="Microsoft YaHei" w:hAnsi="Microsoft YaHei"/>
+          <w:b w:val="0"/>
+        </w:rPr>
+        <w:t xml:space="preserve">，前端直接提示「活动标签与手机号不可同时搜索，请只保留一种方式」并拦截；否则按所选方式调用 </w:t>
       </w:r>
       <w:r>
         <w:rPr>
           <w:rFonts w:ascii="Microsoft YaHei" w:hAnsi="Microsoft YaHei" w:eastAsia="Microsoft YaHei"/>
           <w:color w:val="BE123C"/>
         </w:rPr>
-        <w:t>GET /api/admin/users?tags=标签1,标签2&amp;phone=手机号&amp;ids=用户ID&amp;page=1&amp;size=500</w:t>
+        <w:t>GET /api/admin/users?tag=活动标签</w:t>
       </w:r>
       <w:r>
         <w:rPr>
           <w:rFonts w:eastAsia="Microsoft YaHei" w:ascii="Microsoft YaHei" w:hAnsi="Microsoft YaHei"/>
           <w:b w:val="0"/>
         </w:rPr>
-        <w:t xml:space="preserve"> 向服务端发起</w:t>
+        <w:t xml:space="preserve"> 或 </w:t>
       </w:r>
       <w:r>
         <w:rPr>
-          <w:rFonts w:eastAsia="Microsoft YaHei" w:ascii="Microsoft YaHei" w:hAnsi="Microsoft YaHei"/>
-          <w:b/>
+          <w:rFonts w:ascii="Microsoft YaHei" w:hAnsi="Microsoft YaHei" w:eastAsia="Microsoft YaHei"/>
+          <w:color w:val="BE123C"/>
         </w:rPr>
-        <w:t>组合筛选</w:t>
+        <w:t>GET /api/admin/users?phone=手机号</w:t>
       </w:r>
       <w:r>
         <w:rPr>
           <w:rFonts w:eastAsia="Microsoft YaHei" w:ascii="Microsoft YaHei" w:hAnsi="Microsoft YaHei"/>
           <w:b w:val="0"/>
         </w:rPr>
-        <w:t>查询；服务端按条件匹配返回用户集合。</w:t>
+        <w:t xml:space="preserve"> 向服务端发起查询，返回用户集合。</w:t>
       </w:r>
     </w:p>
     <w:p>
@@ -4572,7 +4832,7 @@
           <w:rFonts w:eastAsia="Microsoft YaHei" w:ascii="Microsoft YaHei" w:hAnsi="Microsoft YaHei"/>
           <w:b w:val="0"/>
         </w:rPr>
-        <w:t>清空所有筛选输入（标签下拉、手机号、用户ID），并仅移除由筛选命中的用户（导入的用户保留），目标用户列表计数同步刷新。</w:t>
+        <w:t>清空筛选输入（活动标签下拉、手机号），并仅移除由筛选命中的用户（导入的用户保留），目标用户列表计数同步刷新。</w:t>
       </w:r>
     </w:p>
     <w:p>
@@ -5099,7 +5359,7 @@
         </w:rPr>
         <w:drawing>
           <wp:inline xmlns:a="http://schemas.openxmlformats.org/drawingml/2006/main" xmlns:pic="http://schemas.openxmlformats.org/drawingml/2006/picture">
-            <wp:extent cx="5303520" cy="3314700"/>
+            <wp:extent cx="5303520" cy="3720751"/>
             <wp:docPr id="6" name="Picture 6"/>
             <wp:cNvGraphicFramePr>
               <a:graphicFrameLocks noChangeAspect="1"/>
@@ -5120,7 +5380,7 @@
                   <pic:spPr>
                     <a:xfrm>
                       <a:off x="0" y="0"/>
-                      <a:ext cx="5303520" cy="3314700"/>
+                      <a:ext cx="5303520" cy="3720751"/>
                     </a:xfrm>
                     <a:prstGeom prst="rect"/>
                   </pic:spPr>
@@ -5709,7 +5969,21 @@
                 <w:rFonts w:eastAsia="Microsoft YaHei" w:ascii="Microsoft YaHei" w:hAnsi="Microsoft YaHei"/>
                 <w:b w:val="0"/>
               </w:rPr>
-              <w:t>用户手机号（脱敏显示：138****1234）</w:t>
+              <w:t>用户手机号（</w:t>
+            </w:r>
+            <w:r>
+              <w:rPr>
+                <w:rFonts w:eastAsia="Microsoft YaHei" w:ascii="Microsoft YaHei" w:hAnsi="Microsoft YaHei"/>
+                <w:b/>
+              </w:rPr>
+              <w:t>后管明文展示，不做脱敏</w:t>
+            </w:r>
+            <w:r>
+              <w:rPr>
+                <w:rFonts w:eastAsia="Microsoft YaHei" w:ascii="Microsoft YaHei" w:hAnsi="Microsoft YaHei"/>
+                <w:b w:val="0"/>
+              </w:rPr>
+              <w:t>：13812341234）</w:t>
             </w:r>
           </w:p>
         </w:tc>
@@ -5920,7 +6194,7 @@
         </w:rPr>
         <w:drawing>
           <wp:inline xmlns:a="http://schemas.openxmlformats.org/drawingml/2006/main" xmlns:pic="http://schemas.openxmlformats.org/drawingml/2006/picture">
-            <wp:extent cx="5303520" cy="3314700"/>
+            <wp:extent cx="5303520" cy="10504557"/>
             <wp:docPr id="7" name="Picture 7"/>
             <wp:cNvGraphicFramePr>
               <a:graphicFrameLocks noChangeAspect="1"/>
@@ -5941,7 +6215,7 @@
                   <pic:spPr>
                     <a:xfrm>
                       <a:off x="0" y="0"/>
-                      <a:ext cx="5303520" cy="3314700"/>
+                      <a:ext cx="5303520" cy="10504557"/>
                     </a:xfrm>
                     <a:prstGeom prst="rect"/>
                   </pic:spPr>
@@ -6014,7 +6288,7 @@
         </w:rPr>
         <w:drawing>
           <wp:inline xmlns:a="http://schemas.openxmlformats.org/drawingml/2006/main" xmlns:pic="http://schemas.openxmlformats.org/drawingml/2006/picture">
-            <wp:extent cx="5303520" cy="3314700"/>
+            <wp:extent cx="5303520" cy="10504557"/>
             <wp:docPr id="8" name="Picture 8"/>
             <wp:cNvGraphicFramePr>
               <a:graphicFrameLocks noChangeAspect="1"/>
@@ -6035,7 +6309,7 @@
                   <pic:spPr>
                     <a:xfrm>
                       <a:off x="0" y="0"/>
-                      <a:ext cx="5303520" cy="3314700"/>
+                      <a:ext cx="5303520" cy="10504557"/>
                     </a:xfrm>
                     <a:prstGeom prst="rect"/>
                   </pic:spPr>
@@ -7726,7 +8000,7 @@
                 <w:rFonts w:eastAsia="Microsoft YaHei" w:ascii="Microsoft YaHei" w:hAnsi="Microsoft YaHei"/>
                 <w:b w:val="0"/>
               </w:rPr>
-              <w:t>在批量操作弹窗</w:t>
+              <w:t>打开批量赠送弹窗</w:t>
             </w:r>
           </w:p>
         </w:tc>
@@ -7741,7 +8015,7 @@
                 <w:rFonts w:eastAsia="Microsoft YaHei" w:ascii="Microsoft YaHei" w:hAnsi="Microsoft YaHei"/>
                 <w:b w:val="0"/>
               </w:rPr>
-              <w:t>理由下拉选择「其他」</w:t>
+              <w:t>在「活动标签」单选下拉选「双11大促」，同时在手机号框输入号码 → 点「搜索」</w:t>
             </w:r>
           </w:p>
         </w:tc>
@@ -7756,7 +8030,7 @@
                 <w:rFonts w:eastAsia="Microsoft YaHei" w:ascii="Microsoft YaHei" w:hAnsi="Microsoft YaHei"/>
                 <w:b w:val="0"/>
               </w:rPr>
-              <w:t>展开自由填写输入框，可输入自定义理由（最长 50 字符）</w:t>
+              <w:t>提示「活动标签与手机号不可同时搜索，请只保留一种方式」，查询被拦截；仅保留一种方式时正常返回命中用户</w:t>
             </w:r>
           </w:p>
         </w:tc>
@@ -7989,7 +8263,7 @@
                 <w:rFonts w:eastAsia="Microsoft YaHei" w:ascii="Microsoft YaHei" w:hAnsi="Microsoft YaHei"/>
                 <w:b w:val="0"/>
               </w:rPr>
-              <w:t>在筛选区标签下拉勾选「高活跃」「VIP会员」→ 点击「搜索」</w:t>
+              <w:t>在「活动标签」单选下拉选「双11大促」→ 点击「搜索」</w:t>
             </w:r>
           </w:p>
         </w:tc>
@@ -8004,7 +8278,7 @@
                 <w:rFonts w:eastAsia="Microsoft YaHei" w:ascii="Microsoft YaHei" w:hAnsi="Microsoft YaHei"/>
                 <w:b w:val="0"/>
               </w:rPr>
-              <w:t>目标用户列表出现命中的用户（去重）；点击「重置」→ 标签清空且由筛选命中的用户被移除，导入用户保留</w:t>
+              <w:t>目标用户列表出现该标签命中的用户（去重）；点击「重置」→ 标签清空且由筛选命中的用户被移除，导入用户保留</w:t>
             </w:r>
           </w:p>
         </w:tc>
@@ -8327,7 +8601,21 @@
                 <w:rFonts w:eastAsia="Microsoft YaHei" w:ascii="Microsoft YaHei" w:hAnsi="Microsoft YaHei"/>
                 <w:b w:val="0"/>
               </w:rPr>
-              <w:t>人数上限 ≤ 9,999（已确认）；数量上限 ≤ 99,999（已确认）；理由 ≤ 50 字；</w:t>
+              <w:t>人数上限 ≤ 9,999（已确认）；数量上限 ≤ 99,999（已确认）；理由：仅预设字典枚举，</w:t>
+            </w:r>
+            <w:r>
+              <w:rPr>
+                <w:rFonts w:eastAsia="Microsoft YaHei" w:ascii="Microsoft YaHei" w:hAnsi="Microsoft YaHei"/>
+                <w:b/>
+              </w:rPr>
+              <w:t>不支持自定义输入</w:t>
+            </w:r>
+            <w:r>
+              <w:rPr>
+                <w:rFonts w:eastAsia="Microsoft YaHei" w:ascii="Microsoft YaHei" w:hAnsi="Microsoft YaHei"/>
+                <w:b w:val="0"/>
+              </w:rPr>
+              <w:t>；</w:t>
             </w:r>
             <w:r>
               <w:rPr>

</xml_diff>